<commit_message>
Update: arayish sablona placeholder-lar elave edildi
</commit_message>
<xml_diff>
--- a/arayish_sablon.docx
+++ b/arayish_sablon.docx
@@ -534,52 +534,47 @@
           <w:szCs w:val="24"/>
           <w:lang w:val="az-Latn-AZ"/>
         </w:rPr>
-        <w:t>İsmay</w:t>
-      </w:r>
-      <w:r>
-        <w:rPr>
-          <w:rFonts w:cs="Arial" w:ascii="Arial" w:hAnsi="Arial"/>
-          <w:sz w:val="24"/>
-          <w:szCs w:val="24"/>
-          <w:lang w:val="az-Latn-AZ"/>
-        </w:rPr>
-        <w:t>ı</w:t>
-      </w:r>
-      <w:r>
-        <w:rPr>
-          <w:rFonts w:cs="Arial" w:ascii="Arial" w:hAnsi="Arial"/>
-          <w:sz w:val="24"/>
-          <w:szCs w:val="24"/>
-          <w:lang w:val="az-Latn-AZ"/>
-        </w:rPr>
-        <w:t xml:space="preserve">lova Gülxarə Əhməd qızı (FİN 0VP6TR5) Azərbaycan Respublikasının Əmək və Əhalinin Sosial Müdafiəsi Nazirliyinin Mərkəzləşdirilmiş elektron informasiya sisteminin “Pensiya” altsisteminə əsasən Nazirliyin tabeliyində Dövlət Sosial Müdafiə Fondundan yaşa görə </w:t>
-      </w:r>
-      <w:r>
-        <w:rPr>
-          <w:rFonts w:cs="Arial" w:ascii="Arial" w:hAnsi="Arial"/>
-          <w:sz w:val="24"/>
-          <w:szCs w:val="24"/>
-          <w:lang w:val="az-Latn-AZ"/>
-        </w:rPr>
-        <w:t>921</w:t>
-      </w:r>
-      <w:r>
-        <w:rPr>
-          <w:rFonts w:cs="Arial" w:ascii="Arial" w:hAnsi="Arial"/>
-          <w:sz w:val="24"/>
-          <w:szCs w:val="24"/>
-          <w:lang w:val="az-Latn-AZ"/>
-        </w:rPr>
-        <w:t>.</w:t>
-      </w:r>
-      <w:r>
-        <w:rPr>
-          <w:rFonts w:cs="Arial" w:ascii="Arial" w:hAnsi="Arial"/>
-          <w:sz w:val="24"/>
-          <w:szCs w:val="24"/>
-          <w:lang w:val="az-Latn-AZ"/>
-        </w:rPr>
-        <w:t>92</w:t>
+        <w:t>{{METN}}</w:t>
+      </w:r>
+      <w:r>
+        <w:rPr>
+          <w:rFonts w:cs="Arial" w:ascii="Arial" w:hAnsi="Arial"/>
+          <w:sz w:val="24"/>
+          <w:szCs w:val="24"/>
+          <w:lang w:val="az-Latn-AZ"/>
+        </w:rPr>
+      </w:r>
+      <w:r>
+        <w:rPr>
+          <w:rFonts w:cs="Arial" w:ascii="Arial" w:hAnsi="Arial"/>
+          <w:sz w:val="24"/>
+          <w:szCs w:val="24"/>
+          <w:lang w:val="az-Latn-AZ"/>
+        </w:rPr>
+      </w:r>
+      <w:r>
+        <w:rPr>
+          <w:rFonts w:cs="Arial" w:ascii="Arial" w:hAnsi="Arial"/>
+          <w:sz w:val="24"/>
+          <w:szCs w:val="24"/>
+          <w:lang w:val="az-Latn-AZ"/>
+        </w:rPr>
+      </w:r>
+      <w:r>
+        <w:rPr>
+          <w:rFonts w:cs="Arial" w:ascii="Arial" w:hAnsi="Arial"/>
+          <w:sz w:val="24"/>
+          <w:szCs w:val="24"/>
+          <w:lang w:val="az-Latn-AZ"/>
+        </w:rPr>
+      </w:r>
+      <w:r>
+        <w:rPr>
+          <w:rFonts w:cs="Arial" w:ascii="Arial" w:hAnsi="Arial"/>
+          <w:sz w:val="24"/>
+          <w:szCs w:val="24"/>
+          <w:lang w:val="az-Latn-AZ"/>
+        </w:rPr>
       </w:r>
       <w:r>
         <w:rPr>
@@ -589,70 +584,62 @@
           <w:shd w:fill="FFFFFF" w:val="clear"/>
           <w:lang w:val="az-Latn-AZ"/>
         </w:rPr>
-        <w:t xml:space="preserve"> manat </w:t>
-      </w:r>
-      <w:r>
-        <w:rPr>
-          <w:rFonts w:cs="Arial" w:ascii="Arial" w:hAnsi="Arial"/>
-          <w:sz w:val="24"/>
-          <w:szCs w:val="24"/>
-          <w:lang w:val="az-Latn-AZ"/>
-        </w:rPr>
-        <w:t>(</w:t>
-      </w:r>
-      <w:r>
-        <w:rPr>
-          <w:rFonts w:cs="Arial" w:ascii="Arial" w:hAnsi="Arial"/>
-          <w:sz w:val="24"/>
-          <w:szCs w:val="24"/>
-          <w:lang w:val="az-Latn-AZ"/>
-        </w:rPr>
-        <w:t>doqquz</w:t>
-      </w:r>
-      <w:r>
-        <w:rPr>
-          <w:rFonts w:cs="Arial" w:ascii="Arial" w:hAnsi="Arial"/>
-          <w:sz w:val="24"/>
-          <w:szCs w:val="24"/>
-          <w:lang w:val="az-Latn-AZ"/>
-        </w:rPr>
-        <w:t xml:space="preserve"> yüz </w:t>
-      </w:r>
-      <w:r>
-        <w:rPr>
-          <w:rFonts w:cs="Arial" w:ascii="Arial" w:hAnsi="Arial"/>
-          <w:sz w:val="24"/>
-          <w:szCs w:val="24"/>
-          <w:lang w:val="az-Latn-AZ"/>
-        </w:rPr>
-        <w:t>iyirmi</w:t>
-      </w:r>
-      <w:r>
-        <w:rPr>
-          <w:rFonts w:cs="Arial" w:ascii="Arial" w:hAnsi="Arial"/>
-          <w:sz w:val="24"/>
-          <w:szCs w:val="24"/>
-          <w:lang w:val="az-Latn-AZ"/>
-        </w:rPr>
-        <w:t xml:space="preserve"> bir manat </w:t>
-      </w:r>
-      <w:r>
-        <w:rPr>
-          <w:rFonts w:cs="Arial" w:ascii="Arial" w:hAnsi="Arial"/>
-          <w:sz w:val="24"/>
-          <w:szCs w:val="24"/>
-          <w:lang w:val="az-Latn-AZ"/>
-        </w:rPr>
-        <w:t>doxsan iki</w:t>
-      </w:r>
-      <w:r>
-        <w:rPr>
-          <w:rFonts w:cs="Arial" w:ascii="Arial" w:hAnsi="Arial"/>
-          <w:sz w:val="24"/>
-          <w:szCs w:val="24"/>
-          <w:lang w:val="az-Latn-AZ"/>
-        </w:rPr>
-        <w:t xml:space="preserve"> qəpik) məbləğində əmək pensiyası alır.</w:t>
+      </w:r>
+      <w:r>
+        <w:rPr>
+          <w:rFonts w:cs="Arial" w:ascii="Arial" w:hAnsi="Arial"/>
+          <w:sz w:val="24"/>
+          <w:szCs w:val="24"/>
+          <w:lang w:val="az-Latn-AZ"/>
+        </w:rPr>
+      </w:r>
+      <w:r>
+        <w:rPr>
+          <w:rFonts w:cs="Arial" w:ascii="Arial" w:hAnsi="Arial"/>
+          <w:sz w:val="24"/>
+          <w:szCs w:val="24"/>
+          <w:lang w:val="az-Latn-AZ"/>
+        </w:rPr>
+      </w:r>
+      <w:r>
+        <w:rPr>
+          <w:rFonts w:cs="Arial" w:ascii="Arial" w:hAnsi="Arial"/>
+          <w:sz w:val="24"/>
+          <w:szCs w:val="24"/>
+          <w:lang w:val="az-Latn-AZ"/>
+        </w:rPr>
+      </w:r>
+      <w:r>
+        <w:rPr>
+          <w:rFonts w:cs="Arial" w:ascii="Arial" w:hAnsi="Arial"/>
+          <w:sz w:val="24"/>
+          <w:szCs w:val="24"/>
+          <w:lang w:val="az-Latn-AZ"/>
+        </w:rPr>
+      </w:r>
+      <w:r>
+        <w:rPr>
+          <w:rFonts w:cs="Arial" w:ascii="Arial" w:hAnsi="Arial"/>
+          <w:sz w:val="24"/>
+          <w:szCs w:val="24"/>
+          <w:lang w:val="az-Latn-AZ"/>
+        </w:rPr>
+      </w:r>
+      <w:r>
+        <w:rPr>
+          <w:rFonts w:cs="Arial" w:ascii="Arial" w:hAnsi="Arial"/>
+          <w:sz w:val="24"/>
+          <w:szCs w:val="24"/>
+          <w:lang w:val="az-Latn-AZ"/>
+        </w:rPr>
+      </w:r>
+      <w:r>
+        <w:rPr>
+          <w:rFonts w:cs="Arial" w:ascii="Arial" w:hAnsi="Arial"/>
+          <w:sz w:val="24"/>
+          <w:szCs w:val="24"/>
+          <w:lang w:val="az-Latn-AZ"/>
+        </w:rPr>
       </w:r>
     </w:p>
     <w:p>
@@ -670,7 +657,7 @@
           <w:szCs w:val="24"/>
           <w:lang w:val="az-Latn-AZ"/>
         </w:rPr>
-        <w:t>Təyinatın bitmə tarixi: müddətsiz.</w:t>
+        <w:t>{{TARIX_METN}}</w:t>
       </w:r>
     </w:p>
     <w:p>
@@ -688,7 +675,7 @@
           <w:szCs w:val="24"/>
           <w:lang w:val="az-Latn-AZ" w:eastAsia="ru-RU"/>
         </w:rPr>
-        <w:t>Arayış</w:t>
+        <w:t>Təyinatın bitmə tarixi: {{BITME}}.</w:t>
       </w:r>
       <w:r>
         <w:rPr>
@@ -703,7 +690,6 @@
           <w:u w:val="none"/>
           <w:em w:val="none"/>
         </w:rPr>
-        <w:t xml:space="preserve"> İsrail Dövlətnin  Azərbaycan Respublikasındakı Səfirliyinə təqdim etmək üçün verilir.</w:t>
       </w:r>
     </w:p>
     <w:p>
@@ -726,6 +712,7 @@
           <w:szCs w:val="24"/>
           <w:lang w:val="az-Latn-AZ" w:eastAsia="ru-RU"/>
         </w:rPr>
+        <w:t>{{YER_METN}}</w:t>
       </w:r>
     </w:p>
     <w:p>
@@ -794,7 +781,7 @@
           <w:sz w:val="24"/>
           <w:szCs w:val="24"/>
         </w:rPr>
-        <w:t>Direktor müavini                                                                                       Şamil Əliyev</w:t>
+        <w:t>{{VEZIFE}}                                                                {{IMZA}}</w:t>
       </w:r>
     </w:p>
     <w:sectPr>

</xml_diff>

<commit_message>
Fix: sablon tek moterizeli placeholder
</commit_message>
<xml_diff>
--- a/arayish_sablon.docx
+++ b/arayish_sablon.docx
@@ -534,7 +534,7 @@
           <w:szCs w:val="24"/>
           <w:lang w:val="az-Latn-AZ"/>
         </w:rPr>
-        <w:t>{{METN}}</w:t>
+        <w:t>{METN}</w:t>
       </w:r>
       <w:r>
         <w:rPr>
@@ -657,7 +657,7 @@
           <w:szCs w:val="24"/>
           <w:lang w:val="az-Latn-AZ"/>
         </w:rPr>
-        <w:t>{{TARIX_METN}}</w:t>
+        <w:t>{TARIX_METN}</w:t>
       </w:r>
     </w:p>
     <w:p>
@@ -675,7 +675,7 @@
           <w:szCs w:val="24"/>
           <w:lang w:val="az-Latn-AZ" w:eastAsia="ru-RU"/>
         </w:rPr>
-        <w:t>Təyinatın bitmə tarixi: {{BITME}}.</w:t>
+        <w:t>Təyinatın bitmə tarixi: {BITME}.</w:t>
       </w:r>
       <w:r>
         <w:rPr>
@@ -712,7 +712,7 @@
           <w:szCs w:val="24"/>
           <w:lang w:val="az-Latn-AZ" w:eastAsia="ru-RU"/>
         </w:rPr>
-        <w:t>{{YER_METN}}</w:t>
+        <w:t>{YER_METN}</w:t>
       </w:r>
     </w:p>
     <w:p>

</xml_diff>

<commit_message>
Fix: Word sablondan gerb silindi
</commit_message>
<xml_diff>
--- a/arayish_sablon.docx
+++ b/arayish_sablon.docx
@@ -17,44 +17,6 @@
       </w:pPr>
       <w:r>
         <w:rPr/>
-        <w:drawing>
-          <wp:inline distT="0" distB="0" distL="0" distR="0">
-            <wp:extent cx="1125220" cy="1228725"/>
-            <wp:effectExtent l="0" t="0" r="0" b="0"/>
-            <wp:docPr id="1" name="Picture 1" descr="C:\Users\isgandar.abdullayev\Desktop\Без названия.jpg"/>
-            <wp:cNvGraphicFramePr>
-              <a:graphicFrameLocks xmlns:a="http://schemas.openxmlformats.org/drawingml/2006/main" noChangeAspect="1"/>
-            </wp:cNvGraphicFramePr>
-            <a:graphic xmlns:a="http://schemas.openxmlformats.org/drawingml/2006/main">
-              <a:graphicData uri="http://schemas.openxmlformats.org/drawingml/2006/picture">
-                <pic:pic xmlns:pic="http://schemas.openxmlformats.org/drawingml/2006/picture">
-                  <pic:nvPicPr>
-                    <pic:cNvPr id="1" name="Picture 1" descr="C:\Users\isgandar.abdullayev\Desktop\Без названия.jpg"/>
-                    <pic:cNvPicPr>
-                      <a:picLocks noChangeAspect="1" noChangeArrowheads="1"/>
-                    </pic:cNvPicPr>
-                  </pic:nvPicPr>
-                  <pic:blipFill>
-                    <a:blip r:embed="rId2"/>
-                    <a:stretch>
-                      <a:fillRect/>
-                    </a:stretch>
-                  </pic:blipFill>
-                  <pic:spPr bwMode="auto">
-                    <a:xfrm>
-                      <a:off x="0" y="0"/>
-                      <a:ext cx="1125220" cy="1228725"/>
-                    </a:xfrm>
-                    <a:prstGeom prst="rect">
-                      <a:avLst/>
-                    </a:prstGeom>
-                    <a:noFill/>
-                  </pic:spPr>
-                </pic:pic>
-              </a:graphicData>
-            </a:graphic>
-          </wp:inline>
-        </w:drawing>
       </w:r>
     </w:p>
     <w:p>

</xml_diff>

<commit_message>
Fix: Word sablon - yalniz ARAYIS, metn, imza, icraçı
</commit_message>
<xml_diff>
--- a/arayish_sablon.docx
+++ b/arayish_sablon.docx
@@ -2,427 +2,6 @@
 <file path=word/document.xml><?xml version="1.0" encoding="utf-8"?>
 <w:document xmlns:o="urn:schemas-microsoft-com:office:office" xmlns:r="http://schemas.openxmlformats.org/officeDocument/2006/relationships" xmlns:v="urn:schemas-microsoft-com:vml" xmlns:w="http://schemas.openxmlformats.org/wordprocessingml/2006/main" xmlns:w10="urn:schemas-microsoft-com:office:word" xmlns:wp="http://schemas.openxmlformats.org/drawingml/2006/wordprocessingDrawing" xmlns:pic="http://schemas.openxmlformats.org/drawingml/2006/picture" xmlns:wps="http://schemas.microsoft.com/office/word/2010/wordprocessingShape" xmlns:wpg="http://schemas.microsoft.com/office/word/2010/wordprocessingGroup" xmlns:mc="http://schemas.openxmlformats.org/markup-compatibility/2006" xmlns:wp14="http://schemas.microsoft.com/office/word/2010/wordprocessingDrawing" xmlns:w14="http://schemas.microsoft.com/office/word/2010/wordml" xmlns:w15="http://schemas.microsoft.com/office/word/2012/wordml" mc:Ignorable="w14 wp14 w15">
   <w:body>
-    <w:p>
-      <w:pPr>
-        <w:pStyle w:val="Normal"/>
-        <w:spacing w:lineRule="auto" w:line="240" w:before="0" w:after="0"/>
-        <w:ind w:left="-1418" w:right="-656"/>
-        <w:jc w:val="center"/>
-        <w:rPr>
-          <w:rStyle w:val="SubtleEmphasis"/>
-          <w:rFonts w:ascii="Arial" w:hAnsi="Arial" w:cs="Arial"/>
-          <w:i w:val="false"/>
-          <w:lang w:val="az-Latn-AZ"/>
-        </w:rPr>
-      </w:pPr>
-      <w:r>
-        <w:rPr/>
-      </w:r>
-    </w:p>
-    <w:p>
-      <w:pPr>
-        <w:pStyle w:val="Normal"/>
-        <w:spacing w:lineRule="auto" w:line="240" w:before="0" w:after="0"/>
-        <w:rPr>
-          <w:rStyle w:val="SubtleEmphasis"/>
-          <w:rFonts w:ascii="Arial" w:hAnsi="Arial" w:cs="Arial"/>
-          <w:i w:val="false"/>
-          <w:sz w:val="18"/>
-          <w:szCs w:val="18"/>
-          <w:lang w:val="az-Latn-AZ"/>
-        </w:rPr>
-      </w:pPr>
-      <w:r>
-        <w:rPr>
-          <w:rFonts w:cs="Arial" w:ascii="Arial" w:hAnsi="Arial"/>
-          <w:i w:val="false"/>
-          <w:sz w:val="18"/>
-          <w:szCs w:val="18"/>
-          <w:lang w:val="az-Latn-AZ"/>
-        </w:rPr>
-      </w:r>
-    </w:p>
-    <w:p>
-      <w:pPr>
-        <w:pStyle w:val="Normal"/>
-        <w:tabs>
-          <w:tab w:val="clear" w:pos="720"/>
-          <w:tab w:val="left" w:pos="709" w:leader="none"/>
-        </w:tabs>
-        <w:spacing w:lineRule="auto" w:line="240" w:before="0" w:after="0"/>
-        <w:ind w:left="-1418" w:right="-656"/>
-        <w:jc w:val="center"/>
-        <w:rPr>
-          <w:rFonts w:ascii="Arial" w:hAnsi="Arial" w:cs="Arial"/>
-          <w:b/>
-          <w:sz w:val="28"/>
-          <w:szCs w:val="28"/>
-          <w:lang w:val="az-Latn-AZ"/>
-        </w:rPr>
-      </w:pPr>
-      <w:r>
-        <w:rPr>
-          <w:rFonts w:cs="Arial" w:ascii="Arial" w:hAnsi="Arial"/>
-          <w:b/>
-          <w:sz w:val="28"/>
-          <w:szCs w:val="28"/>
-          <w:lang w:val="az-Latn-AZ"/>
-        </w:rPr>
-        <w:t>AZƏRBAYCAN RESPUBLİKASININ</w:t>
-      </w:r>
-    </w:p>
-    <w:p>
-      <w:pPr>
-        <w:pStyle w:val="Normal"/>
-        <w:tabs>
-          <w:tab w:val="clear" w:pos="720"/>
-          <w:tab w:val="left" w:pos="709" w:leader="none"/>
-        </w:tabs>
-        <w:spacing w:lineRule="auto" w:line="240" w:before="0" w:after="0"/>
-        <w:ind w:left="-1418" w:right="-656"/>
-        <w:jc w:val="center"/>
-        <w:rPr>
-          <w:rFonts w:ascii="Arial" w:hAnsi="Arial" w:cs="Arial"/>
-          <w:b/>
-          <w:sz w:val="28"/>
-          <w:szCs w:val="28"/>
-          <w:lang w:val="az-Latn-AZ"/>
-        </w:rPr>
-      </w:pPr>
-      <w:r>
-        <w:rPr>
-          <w:rFonts w:cs="Arial" w:ascii="Arial" w:hAnsi="Arial"/>
-          <w:b/>
-          <w:sz w:val="28"/>
-          <w:szCs w:val="28"/>
-          <w:lang w:val="az-Latn-AZ"/>
-        </w:rPr>
-        <w:t xml:space="preserve">ƏMƏK VƏ ƏHALİNİN SOSİAL MÜDAFİƏSİ NAZİRLİYİNİN TABELİYİNDƏ </w:t>
-      </w:r>
-    </w:p>
-    <w:p>
-      <w:pPr>
-        <w:pStyle w:val="Normal"/>
-        <w:tabs>
-          <w:tab w:val="clear" w:pos="720"/>
-          <w:tab w:val="left" w:pos="709" w:leader="none"/>
-        </w:tabs>
-        <w:spacing w:lineRule="auto" w:line="240" w:before="0" w:after="0"/>
-        <w:ind w:left="-1418" w:right="-656"/>
-        <w:jc w:val="center"/>
-        <w:rPr>
-          <w:rFonts w:ascii="Arial" w:hAnsi="Arial" w:cs="Arial"/>
-          <w:b/>
-          <w:sz w:val="28"/>
-          <w:szCs w:val="28"/>
-          <w:lang w:val="az-Latn-AZ"/>
-        </w:rPr>
-      </w:pPr>
-      <w:r>
-        <w:rPr>
-          <w:rFonts w:cs="Arial" w:ascii="Arial" w:hAnsi="Arial"/>
-          <w:b/>
-          <w:sz w:val="28"/>
-          <w:szCs w:val="28"/>
-          <w:lang w:val="az-Latn-AZ"/>
-        </w:rPr>
-        <w:t>DAYANIQLI VƏ OPERATİV SOSİAL TƏMİNAT AGENTLİYİ</w:t>
-      </w:r>
-    </w:p>
-    <w:p>
-      <w:pPr>
-        <w:pStyle w:val="Normal"/>
-        <w:tabs>
-          <w:tab w:val="clear" w:pos="720"/>
-          <w:tab w:val="left" w:pos="709" w:leader="none"/>
-        </w:tabs>
-        <w:spacing w:lineRule="auto" w:line="240" w:before="0" w:after="0"/>
-        <w:ind w:left="-1418" w:right="-656"/>
-        <w:jc w:val="center"/>
-        <w:rPr>
-          <w:rFonts w:ascii="Arial" w:hAnsi="Arial" w:cs="Arial"/>
-          <w:b/>
-          <w:sz w:val="28"/>
-          <w:szCs w:val="28"/>
-          <w:lang w:val="az-Latn-AZ"/>
-        </w:rPr>
-      </w:pPr>
-      <w:r>
-        <w:rPr>
-          <w:rFonts w:cs="Arial" w:ascii="Arial" w:hAnsi="Arial"/>
-          <w:b/>
-          <w:sz w:val="28"/>
-          <w:szCs w:val="28"/>
-          <w:lang w:val="az-Latn-AZ"/>
-        </w:rPr>
-        <w:t>3 SAYLI BAKI DOST MƏRKƏZİ</w:t>
-      </w:r>
-    </w:p>
-    <w:p>
-      <w:pPr>
-        <w:pStyle w:val="Normal"/>
-        <w:tabs>
-          <w:tab w:val="clear" w:pos="720"/>
-          <w:tab w:val="left" w:pos="709" w:leader="none"/>
-        </w:tabs>
-        <w:spacing w:lineRule="auto" w:line="22"/>
-        <w:ind w:left="-992" w:right="-233"/>
-        <w:jc w:val="center"/>
-        <w:rPr>
-          <w:rFonts w:ascii="Arial" w:hAnsi="Arial" w:cs="Arial"/>
-          <w:b/>
-          <w:sz w:val="28"/>
-          <w:szCs w:val="28"/>
-          <w:lang w:val="az-Latn-AZ"/>
-        </w:rPr>
-      </w:pPr>
-      <w:r>
-        <w:rPr>
-          <w:rFonts w:cs="Arial" w:ascii="Arial" w:hAnsi="Arial"/>
-          <w:sz w:val="24"/>
-          <w:szCs w:val="24"/>
-          <w:lang w:val="az-Latn-AZ"/>
-        </w:rPr>
-        <w:t>________________________________________________________________________________</w:t>
-      </w:r>
-    </w:p>
-    <w:p>
-      <w:pPr>
-        <w:pStyle w:val="Normal"/>
-        <w:tabs>
-          <w:tab w:val="clear" w:pos="720"/>
-          <w:tab w:val="left" w:pos="709" w:leader="none"/>
-        </w:tabs>
-        <w:spacing w:before="0" w:after="0"/>
-        <w:ind w:left="-851"/>
-        <w:jc w:val="both"/>
-        <w:rPr>
-          <w:rFonts w:ascii="Arial" w:hAnsi="Arial" w:cs="Arial"/>
-          <w:sz w:val="18"/>
-          <w:szCs w:val="18"/>
-          <w:lang w:val="az-Latn-AZ"/>
-        </w:rPr>
-      </w:pPr>
-      <w:r>
-        <w:rPr>
-          <w:rFonts w:cs="Arial" w:ascii="Arial" w:hAnsi="Arial"/>
-          <w:sz w:val="18"/>
-          <w:szCs w:val="18"/>
-          <w:lang w:val="az-Latn-AZ"/>
-        </w:rPr>
-        <w:t xml:space="preserve">     </w:t>
-      </w:r>
-      <w:r>
-        <w:rPr>
-          <w:rFonts w:cs="Arial" w:ascii="Arial" w:hAnsi="Arial"/>
-          <w:sz w:val="18"/>
-          <w:szCs w:val="18"/>
-          <w:lang w:val="az-Latn-AZ"/>
-        </w:rPr>
-        <w:t xml:space="preserve">AZ 1029, Bakı şəhəri, Nizami rayonu,                                                                                                                     Tel: (+99412) 142  </w:t>
-      </w:r>
-    </w:p>
-    <w:p>
-      <w:pPr>
-        <w:pStyle w:val="Normal"/>
-        <w:tabs>
-          <w:tab w:val="clear" w:pos="720"/>
-          <w:tab w:val="left" w:pos="709" w:leader="none"/>
-        </w:tabs>
-        <w:spacing w:before="0" w:after="0"/>
-        <w:ind w:left="-851"/>
-        <w:jc w:val="both"/>
-        <w:rPr>
-          <w:rFonts w:ascii="Arial" w:hAnsi="Arial" w:cs="Arial"/>
-          <w:sz w:val="18"/>
-          <w:szCs w:val="18"/>
-          <w:lang w:val="az-Latn-AZ"/>
-        </w:rPr>
-      </w:pPr>
-      <w:r>
-        <w:rPr>
-          <w:rFonts w:cs="Arial" w:ascii="Arial" w:hAnsi="Arial"/>
-          <w:sz w:val="18"/>
-          <w:szCs w:val="18"/>
-          <w:lang w:val="az-Latn-AZ"/>
-        </w:rPr>
-        <w:t xml:space="preserve">     </w:t>
-      </w:r>
-      <w:r>
-        <w:rPr>
-          <w:rFonts w:cs="Arial" w:ascii="Arial" w:hAnsi="Arial"/>
-          <w:sz w:val="18"/>
-          <w:szCs w:val="18"/>
-          <w:lang w:val="az-Latn-AZ"/>
-        </w:rPr>
-        <w:t xml:space="preserve">Keşlə ŞTQ Heydər Əliyev prospekti, ev 183B                                                                                   e-poçt: </w:t>
-      </w:r>
-      <w:hyperlink r:id="rId3">
-        <w:r>
-          <w:rPr>
-            <w:rStyle w:val="Hyperlink"/>
-            <w:rFonts w:cs="Arial" w:ascii="Arial" w:hAnsi="Arial"/>
-            <w:sz w:val="18"/>
-            <w:szCs w:val="18"/>
-            <w:lang w:val="az-Latn-AZ"/>
-          </w:rPr>
-          <w:t>dost_info@sosial.gov.az</w:t>
-        </w:r>
-      </w:hyperlink>
-    </w:p>
-    <w:p>
-      <w:pPr>
-        <w:pStyle w:val="Normal"/>
-        <w:tabs>
-          <w:tab w:val="clear" w:pos="720"/>
-          <w:tab w:val="left" w:pos="709" w:leader="none"/>
-        </w:tabs>
-        <w:spacing w:lineRule="auto" w:line="22"/>
-        <w:ind w:left="-992" w:right="-233"/>
-        <w:jc w:val="center"/>
-        <w:rPr>
-          <w:rFonts w:ascii="Arial" w:hAnsi="Arial" w:cs="Arial"/>
-          <w:b/>
-          <w:sz w:val="28"/>
-          <w:szCs w:val="28"/>
-          <w:lang w:val="az-Latn-AZ"/>
-        </w:rPr>
-      </w:pPr>
-      <w:r>
-        <w:rPr>
-          <w:rFonts w:cs="Arial" w:ascii="Arial" w:hAnsi="Arial"/>
-          <w:sz w:val="24"/>
-          <w:szCs w:val="24"/>
-          <w:lang w:val="az-Latn-AZ"/>
-        </w:rPr>
-        <w:t>________________________________________________________________________________</w:t>
-      </w:r>
-    </w:p>
-    <w:p>
-      <w:pPr>
-        <w:pStyle w:val="Normal"/>
-        <w:spacing w:lineRule="auto" w:line="240" w:before="0" w:after="0"/>
-        <w:jc w:val="center"/>
-        <w:rPr>
-          <w:rFonts w:ascii="Arial" w:hAnsi="Arial" w:cs="Arial"/>
-          <w:b/>
-          <w:bCs/>
-          <w:sz w:val="24"/>
-          <w:szCs w:val="24"/>
-          <w:lang w:val="az-Latn-AZ"/>
-        </w:rPr>
-      </w:pPr>
-      <w:r>
-        <w:rPr>
-          <w:rFonts w:cs="Arial" w:ascii="Arial" w:hAnsi="Arial"/>
-          <w:b/>
-          <w:bCs/>
-          <w:sz w:val="24"/>
-          <w:szCs w:val="24"/>
-          <w:lang w:val="az-Latn-AZ"/>
-        </w:rPr>
-      </w:r>
-    </w:p>
-    <w:p>
-      <w:pPr>
-        <w:pStyle w:val="Normal"/>
-        <w:spacing w:lineRule="auto" w:line="240" w:before="0" w:after="0"/>
-        <w:jc w:val="center"/>
-        <w:rPr>
-          <w:rFonts w:ascii="Arial" w:hAnsi="Arial" w:cs="Arial"/>
-          <w:b/>
-          <w:bCs/>
-          <w:sz w:val="24"/>
-          <w:szCs w:val="24"/>
-          <w:lang w:val="az-Latn-AZ"/>
-        </w:rPr>
-      </w:pPr>
-      <w:r>
-        <w:rPr>
-          <w:rFonts w:cs="Arial" w:ascii="Arial" w:hAnsi="Arial"/>
-          <w:b/>
-          <w:bCs/>
-          <w:sz w:val="24"/>
-          <w:szCs w:val="24"/>
-          <w:lang w:val="az-Latn-AZ"/>
-        </w:rPr>
-      </w:r>
-    </w:p>
-    <w:p>
-      <w:pPr>
-        <w:pStyle w:val="Normal"/>
-        <w:spacing w:lineRule="auto" w:line="240" w:before="0" w:after="0"/>
-        <w:jc w:val="center"/>
-        <w:rPr>
-          <w:rFonts w:ascii="Arial" w:hAnsi="Arial" w:cs="Arial"/>
-          <w:b/>
-          <w:bCs/>
-          <w:sz w:val="24"/>
-          <w:szCs w:val="24"/>
-          <w:lang w:val="az-Latn-AZ"/>
-        </w:rPr>
-      </w:pPr>
-      <w:r>
-        <w:rPr>
-          <w:rFonts w:cs="Arial" w:ascii="Arial" w:hAnsi="Arial"/>
-          <w:b/>
-          <w:bCs/>
-          <w:sz w:val="24"/>
-          <w:szCs w:val="24"/>
-          <w:lang w:val="az-Latn-AZ"/>
-        </w:rPr>
-      </w:r>
-    </w:p>
-    <w:p>
-      <w:pPr>
-        <w:pStyle w:val="Normal"/>
-        <w:spacing w:lineRule="auto" w:line="240" w:before="0" w:after="0"/>
-        <w:jc w:val="center"/>
-        <w:rPr>
-          <w:rFonts w:ascii="Arial" w:hAnsi="Arial" w:cs="Arial"/>
-          <w:b/>
-          <w:bCs/>
-          <w:sz w:val="24"/>
-          <w:szCs w:val="24"/>
-          <w:lang w:val="az-Latn-AZ"/>
-        </w:rPr>
-      </w:pPr>
-      <w:r>
-        <w:rPr>
-          <w:rFonts w:cs="Arial" w:ascii="Arial" w:hAnsi="Arial"/>
-          <w:b/>
-          <w:bCs/>
-          <w:sz w:val="24"/>
-          <w:szCs w:val="24"/>
-          <w:lang w:val="az-Latn-AZ"/>
-        </w:rPr>
-      </w:r>
-    </w:p>
-    <w:p>
-      <w:pPr>
-        <w:pStyle w:val="Normal"/>
-        <w:spacing w:lineRule="auto" w:line="240" w:before="0" w:after="0"/>
-        <w:jc w:val="center"/>
-        <w:rPr>
-          <w:rFonts w:ascii="Arial" w:hAnsi="Arial" w:cs="Arial"/>
-          <w:b/>
-          <w:bCs/>
-          <w:sz w:val="24"/>
-          <w:szCs w:val="24"/>
-          <w:lang w:val="az-Latn-AZ"/>
-        </w:rPr>
-      </w:pPr>
-      <w:r>
-        <w:rPr>
-          <w:rFonts w:cs="Arial" w:ascii="Arial" w:hAnsi="Arial"/>
-          <w:b/>
-          <w:bCs/>
-          <w:sz w:val="24"/>
-          <w:szCs w:val="24"/>
-          <w:lang w:val="az-Latn-AZ"/>
-        </w:rPr>
-      </w:r>
-    </w:p>
     <w:p>
       <w:pPr>
         <w:pStyle w:val="Normal"/>
@@ -674,7 +253,6 @@
           <w:szCs w:val="24"/>
           <w:lang w:val="az-Latn-AZ" w:eastAsia="ru-RU"/>
         </w:rPr>
-        <w:t>{YER_METN}</w:t>
       </w:r>
     </w:p>
     <w:p>
@@ -719,6 +297,12 @@
           <w:szCs w:val="24"/>
           <w:lang w:val="az-Latn-AZ" w:eastAsia="ru-RU"/>
         </w:rPr>
+      </w:r>
+    </w:p>
+    <w:p>
+      <w:r>
+        <w:rPr/>
+        <w:t>İcraçı: İmanov Həsən</w:t>
       </w:r>
     </w:p>
     <w:p>

</xml_diff>

<commit_message>
Fix: Word sablon - 25 bos setir, icraçı 2ci sehifede
</commit_message>
<xml_diff>
--- a/arayish_sablon.docx
+++ b/arayish_sablon.docx
@@ -2,6 +2,31 @@
 <file path=word/document.xml><?xml version="1.0" encoding="utf-8"?>
 <w:document xmlns:o="urn:schemas-microsoft-com:office:office" xmlns:r="http://schemas.openxmlformats.org/officeDocument/2006/relationships" xmlns:v="urn:schemas-microsoft-com:vml" xmlns:w="http://schemas.openxmlformats.org/wordprocessingml/2006/main" xmlns:w10="urn:schemas-microsoft-com:office:word" xmlns:wp="http://schemas.openxmlformats.org/drawingml/2006/wordprocessingDrawing" xmlns:pic="http://schemas.openxmlformats.org/drawingml/2006/picture" xmlns:wps="http://schemas.microsoft.com/office/word/2010/wordprocessingShape" xmlns:wpg="http://schemas.microsoft.com/office/word/2010/wordprocessingGroup" xmlns:mc="http://schemas.openxmlformats.org/markup-compatibility/2006" xmlns:wp14="http://schemas.microsoft.com/office/word/2010/wordprocessingDrawing" xmlns:w14="http://schemas.microsoft.com/office/word/2010/wordml" xmlns:w15="http://schemas.microsoft.com/office/word/2012/wordml" mc:Ignorable="w14 wp14 w15">
   <w:body>
+    <w:p/>
+    <w:p/>
+    <w:p/>
+    <w:p/>
+    <w:p/>
+    <w:p/>
+    <w:p/>
+    <w:p/>
+    <w:p/>
+    <w:p/>
+    <w:p/>
+    <w:p/>
+    <w:p/>
+    <w:p/>
+    <w:p/>
+    <w:p/>
+    <w:p/>
+    <w:p/>
+    <w:p/>
+    <w:p/>
+    <w:p/>
+    <w:p/>
+    <w:p/>
+    <w:p/>
+    <w:p/>
     <w:p>
       <w:pPr>
         <w:pStyle w:val="Normal"/>
@@ -328,6 +353,98 @@
           <w:szCs w:val="24"/>
         </w:rPr>
         <w:t>Direktor müavini                                                                                       Şamil Əliyev</w:t>
+      </w:r>
+    </w:p>
+    <w:p>
+      <w:r>
+        <w:br w:type="page"/>
+      </w:r>
+    </w:p>
+    <w:p/>
+    <w:p/>
+    <w:p/>
+    <w:p/>
+    <w:p/>
+    <w:p/>
+    <w:p/>
+    <w:p/>
+    <w:p/>
+    <w:p/>
+    <w:p/>
+    <w:p/>
+    <w:p/>
+    <w:p/>
+    <w:p/>
+    <w:p/>
+    <w:p/>
+    <w:p/>
+    <w:p/>
+    <w:p/>
+    <w:p/>
+    <w:p/>
+    <w:p/>
+    <w:p/>
+    <w:p/>
+    <w:p/>
+    <w:p/>
+    <w:p/>
+    <w:p/>
+    <w:p/>
+    <w:p/>
+    <w:p/>
+    <w:p/>
+    <w:p/>
+    <w:p/>
+    <w:p/>
+    <w:p/>
+    <w:p/>
+    <w:p/>
+    <w:p/>
+    <w:p/>
+    <w:p/>
+    <w:p/>
+    <w:p/>
+    <w:p/>
+    <w:p/>
+    <w:p/>
+    <w:p/>
+    <w:p/>
+    <w:p/>
+    <w:p/>
+    <w:p/>
+    <w:p/>
+    <w:p/>
+    <w:p/>
+    <w:p>
+      <w:r>
+        <w:rPr>
+          <w:sz w:val="24"/>
+        </w:rPr>
+        <w:t>Qəbul etdim: ________________</w:t>
+      </w:r>
+    </w:p>
+    <w:p>
+      <w:r>
+        <w:rPr>
+          <w:sz w:val="24"/>
+        </w:rPr>
+        <w:t>Tarix: ________________</w:t>
+      </w:r>
+    </w:p>
+    <w:p>
+      <w:r>
+        <w:rPr>
+          <w:sz w:val="24"/>
+        </w:rPr>
+        <w:t/>
+      </w:r>
+    </w:p>
+    <w:p>
+      <w:r>
+        <w:rPr>
+          <w:sz w:val="24"/>
+        </w:rPr>
+        <w:t>İcraçı: İmanov Həsən</w:t>
       </w:r>
     </w:p>
     <w:sectPr>

</xml_diff>

<commit_message>
Fix: 2ci sehife Qasimova elave edildi
</commit_message>
<xml_diff>
--- a/arayish_sablon.docx
+++ b/arayish_sablon.docx
@@ -322,12 +322,6 @@
           <w:szCs w:val="24"/>
           <w:lang w:val="az-Latn-AZ" w:eastAsia="ru-RU"/>
         </w:rPr>
-      </w:r>
-    </w:p>
-    <w:p>
-      <w:r>
-        <w:rPr/>
-        <w:t>İcraçı: İmanov Həsən</w:t>
       </w:r>
     </w:p>
     <w:p>
@@ -420,7 +414,7 @@
         <w:rPr>
           <w:sz w:val="24"/>
         </w:rPr>
-        <w:t>Qəbul etdim: ________________</w:t>
+        <w:t>Qəbul etdim: ________________  Qasımova Yasəmən Şakir qızı (səlahiyyətli nümayəndə)</w:t>
       </w:r>
     </w:p>
     <w:p>

</xml_diff>

<commit_message>
Fix: ARAYIS 13 setir asagida
</commit_message>
<xml_diff>
--- a/arayish_sablon.docx
+++ b/arayish_sablon.docx
@@ -2,18 +2,6 @@
 <file path=word/document.xml><?xml version="1.0" encoding="utf-8"?>
 <w:document xmlns:o="urn:schemas-microsoft-com:office:office" xmlns:r="http://schemas.openxmlformats.org/officeDocument/2006/relationships" xmlns:v="urn:schemas-microsoft-com:vml" xmlns:w="http://schemas.openxmlformats.org/wordprocessingml/2006/main" xmlns:w10="urn:schemas-microsoft-com:office:word" xmlns:wp="http://schemas.openxmlformats.org/drawingml/2006/wordprocessingDrawing" xmlns:pic="http://schemas.openxmlformats.org/drawingml/2006/picture" xmlns:wps="http://schemas.microsoft.com/office/word/2010/wordprocessingShape" xmlns:wpg="http://schemas.microsoft.com/office/word/2010/wordprocessingGroup" xmlns:mc="http://schemas.openxmlformats.org/markup-compatibility/2006" xmlns:wp14="http://schemas.microsoft.com/office/word/2010/wordprocessingDrawing" xmlns:w14="http://schemas.microsoft.com/office/word/2010/wordml" xmlns:w15="http://schemas.microsoft.com/office/word/2012/wordml" mc:Ignorable="w14 wp14 w15">
   <w:body>
-    <w:p/>
-    <w:p/>
-    <w:p/>
-    <w:p/>
-    <w:p/>
-    <w:p/>
-    <w:p/>
-    <w:p/>
-    <w:p/>
-    <w:p/>
-    <w:p/>
-    <w:p/>
     <w:p/>
     <w:p/>
     <w:p/>

</xml_diff>

<commit_message>
Fix: arayish_sablon.docx 2 sehife, qebulAd
</commit_message>
<xml_diff>
--- a/arayish_sablon.docx
+++ b/arayish_sablon.docx
@@ -401,32 +401,36 @@
       <w:r>
         <w:rPr>
           <w:sz w:val="24"/>
-        </w:rPr>
-        <w:t>Qəbul etdim: ________________  Qasımova Yasəmən Şakir qızı (səlahiyyətli nümayəndə)</w:t>
+          <w:szCs w:val="24"/>
+        </w:rPr>
+        <w:t xml:space="preserve">Qəbul etdim: ________________  {QEBUL_AD}</w:t>
       </w:r>
     </w:p>
     <w:p>
       <w:r>
         <w:rPr>
           <w:sz w:val="24"/>
-        </w:rPr>
-        <w:t>Tarix: ________________</w:t>
+          <w:szCs w:val="24"/>
+        </w:rPr>
+        <w:t xml:space="preserve">Tarix: ________________</w:t>
       </w:r>
     </w:p>
     <w:p>
       <w:r>
         <w:rPr>
           <w:sz w:val="24"/>
-        </w:rPr>
-        <w:t/>
+          <w:szCs w:val="24"/>
+        </w:rPr>
+        <w:t xml:space="preserve"/>
       </w:r>
     </w:p>
     <w:p>
       <w:r>
         <w:rPr>
           <w:sz w:val="24"/>
-        </w:rPr>
-        <w:t>İcraçı: İmanov Həsən</w:t>
+          <w:szCs w:val="24"/>
+        </w:rPr>
+        <w:t xml:space="preserve">İcraçı: İmanov Həsən</w:t>
       </w:r>
     </w:p>
     <w:sectPr>

</xml_diff>

<commit_message>
Fix: Qebul etdim 31 setir yuxari
</commit_message>
<xml_diff>
--- a/arayish_sablon.docx
+++ b/arayish_sablon.docx
@@ -109,41 +109,6 @@
         <w:t>Şamil Əliyev</w:t>
       </w:r>
     </w:p>
-    <w:p>
-      <w:r>
-        <w:br w:type="page"/>
-      </w:r>
-    </w:p>
-    <w:p/>
-    <w:p/>
-    <w:p/>
-    <w:p/>
-    <w:p/>
-    <w:p/>
-    <w:p/>
-    <w:p/>
-    <w:p/>
-    <w:p/>
-    <w:p/>
-    <w:p/>
-    <w:p/>
-    <w:p/>
-    <w:p/>
-    <w:p/>
-    <w:p/>
-    <w:p/>
-    <w:p/>
-    <w:p/>
-    <w:p/>
-    <w:p/>
-    <w:p/>
-    <w:p/>
-    <w:p/>
-    <w:p/>
-    <w:p/>
-    <w:p/>
-    <w:p/>
-    <w:p/>
     <w:p/>
     <w:p/>
     <w:p/>

</xml_diff>

<commit_message>
Fix: metn, bitme, yer arasi bosluklar
</commit_message>
<xml_diff>
--- a/arayish_sablon.docx
+++ b/arayish_sablon.docx
@@ -43,6 +43,7 @@
         <w:t>{METN}</w:t>
       </w:r>
     </w:p>
+    <w:p/>
     <w:p>
       <w:pPr>
         <w:ind w:firstLine="709"/>
@@ -69,6 +70,7 @@
         <w:t>Təyinatın bitmə tarixi: {BITME}.</w:t>
       </w:r>
     </w:p>
+    <w:p/>
     <w:p>
       <w:pPr>
         <w:ind w:firstLine="709"/>
@@ -82,6 +84,9 @@
         <w:t>{YER_METN}</w:t>
       </w:r>
     </w:p>
+    <w:p/>
+    <w:p/>
+    <w:p/>
     <w:p/>
     <w:p/>
     <w:p/>

</xml_diff>

<commit_message>
Fix: arayish_sablon.docx spacing ve indent
</commit_message>
<xml_diff>
--- a/arayish_sablon.docx
+++ b/arayish_sablon.docx
@@ -70,22 +70,6 @@
         <w:t>Təyinatın bitmə tarixi: {BITME}.</w:t>
       </w:r>
     </w:p>
-    <w:p/>
-    <w:p>
-      <w:pPr>
-        <w:ind w:firstLine="709"/>
-      </w:pPr>
-      <w:r>
-        <w:rPr>
-          <w:rFonts w:ascii="Arial" w:hAnsi="Arial"/>
-          <w:b w:val="0"/>
-          <w:sz w:val="24"/>
-        </w:rPr>
-        <w:t>{YER_METN}</w:t>
-      </w:r>
-    </w:p>
-    <w:p/>
-    <w:p/>
     <w:p/>
     <w:p/>
     <w:p/>

</xml_diff>

<commit_message>
Revert: arayish sablon ee13e60-a qayidildi
</commit_message>
<xml_diff>
--- a/arayish_sablon.docx
+++ b/arayish_sablon.docx
@@ -43,7 +43,6 @@
         <w:t>{METN}</w:t>
       </w:r>
     </w:p>
-    <w:p/>
     <w:p>
       <w:pPr>
         <w:ind w:firstLine="709"/>
@@ -70,7 +69,19 @@
         <w:t>Təyinatın bitmə tarixi: {BITME}.</w:t>
       </w:r>
     </w:p>
-    <w:p/>
+    <w:p>
+      <w:pPr>
+        <w:ind w:firstLine="709"/>
+      </w:pPr>
+      <w:r>
+        <w:rPr>
+          <w:rFonts w:ascii="Arial" w:hAnsi="Arial"/>
+          <w:b w:val="0"/>
+          <w:sz w:val="24"/>
+        </w:rPr>
+        <w:t>{YER_METN}</w:t>
+      </w:r>
+    </w:p>
     <w:p/>
     <w:p/>
     <w:p/>
@@ -79,7 +90,6 @@
         <w:tabs>
           <w:tab w:val="right" w:pos="9354"/>
         </w:tabs>
-        <w:ind w:left="709"/>
       </w:pPr>
       <w:r>
         <w:rPr>

</xml_diff>

<commit_message>
fix: Bitmə tarixi 1 sətir yuxarı, Direktor 1 sətir yuxarı, ikinci səhifə 1 cərgəyə
</commit_message>
<xml_diff>
--- a/arayish_sablon.docx
+++ b/arayish_sablon.docx
@@ -83,8 +83,6 @@
       </w:r>
     </w:p>
     <w:p/>
-    <w:p/>
-    <w:p/>
     <w:p>
       <w:pPr>
         <w:tabs>
@@ -110,33 +108,6 @@
         <w:t>Şamil Əliyev</w:t>
       </w:r>
     </w:p>
-    <w:p/>
-    <w:p/>
-    <w:p/>
-    <w:p/>
-    <w:p/>
-    <w:p/>
-    <w:p/>
-    <w:p/>
-    <w:p/>
-    <w:p/>
-    <w:p/>
-    <w:p/>
-    <w:p/>
-    <w:p/>
-    <w:p/>
-    <w:p/>
-    <w:p/>
-    <w:p/>
-    <w:p/>
-    <w:p/>
-    <w:p/>
-    <w:p/>
-    <w:p/>
-    <w:p/>
-    <w:p/>
-    <w:p/>
-    <w:p/>
     <w:p>
       <w:r>
         <w:rPr>
@@ -157,7 +128,6 @@
         <w:t>Tarix: ________________</w:t>
       </w:r>
     </w:p>
-    <w:p/>
     <w:p>
       <w:r>
         <w:rPr>

</xml_diff>

<commit_message>
fix: boşluq silindi, Direktor aşağı, Qəbul etdim ikinci səhifəyə
</commit_message>
<xml_diff>
--- a/arayish_sablon.docx
+++ b/arayish_sablon.docx
@@ -82,13 +82,13 @@
         <w:t>{YER_METN}</w:t>
       </w:r>
     </w:p>
-    <w:p/>
     <w:p>
       <w:pPr>
         <w:tabs>
           <w:tab w:val="right" w:pos="9637"/>
         </w:tabs>
         <w:ind w:left="709"/>
+        <w:spacing w:before="280"/>
       </w:pPr>
       <w:r>
         <w:rPr>
@@ -109,6 +109,9 @@
       </w:r>
     </w:p>
     <w:p>
+      <w:pPr>
+        <w:pageBreakBefore w:val="1"/>
+      </w:pPr>
       <w:r>
         <w:rPr>
           <w:rFonts w:ascii="Arial" w:hAnsi="Arial"/>

</xml_diff>

<commit_message>
fix: Qəbul etdim 24pt aşağı, Bitmə tarixi 1 sətir yuxarı, Direktor 2 sətir aşağı
</commit_message>
<xml_diff>
--- a/arayish_sablon.docx
+++ b/arayish_sablon.docx
@@ -46,6 +46,7 @@
     <w:p>
       <w:pPr>
         <w:ind w:firstLine="709"/>
+        <w:spacing w:after="0"/>
       </w:pPr>
       <w:r>
         <w:rPr>
@@ -59,6 +60,7 @@
     <w:p>
       <w:pPr>
         <w:ind w:firstLine="709"/>
+        <w:spacing w:before="0"/>
       </w:pPr>
       <w:r>
         <w:rPr>
@@ -88,7 +90,7 @@
           <w:tab w:val="right" w:pos="9637"/>
         </w:tabs>
         <w:ind w:left="709"/>
-        <w:spacing w:before="280"/>
+        <w:spacing w:before="480"/>
       </w:pPr>
       <w:r>
         <w:rPr>
@@ -111,6 +113,7 @@
     <w:p>
       <w:pPr>
         <w:pageBreakBefore w:val="1"/>
+        <w:spacing w:before="480"/>
       </w:pPr>
       <w:r>
         <w:rPr>

</xml_diff>

<commit_message>
fix: Qəbul etdim 24 sətir aşağı (3-cü səhifəyə keçmədən)
</commit_message>
<xml_diff>
--- a/arayish_sablon.docx
+++ b/arayish_sablon.docx
@@ -110,10 +110,33 @@
         <w:t>Şamil Əliyev</w:t>
       </w:r>
     </w:p>
+    <w:p/>
+    <w:p/>
+    <w:p/>
+    <w:p/>
+    <w:p/>
+    <w:p/>
+    <w:p/>
+    <w:p/>
+    <w:p/>
+    <w:p/>
+    <w:p/>
+    <w:p/>
+    <w:p/>
+    <w:p/>
+    <w:p/>
+    <w:p/>
+    <w:p/>
+    <w:p/>
+    <w:p/>
+    <w:p/>
+    <w:p/>
+    <w:p/>
+    <w:p/>
     <w:p>
       <w:pPr>
         <w:pageBreakBefore w:val="1"/>
-        <w:spacing w:before="480"/>
+        <w:spacing w:before="0"/>
       </w:pPr>
       <w:r>
         <w:rPr>

</xml_diff>

<commit_message>
feat: Hüququn yaranma tarixi əlavə edildi, aralıqlar düzəldildi
</commit_message>
<xml_diff>
--- a/arayish_sablon.docx
+++ b/arayish_sablon.docx
@@ -33,6 +33,7 @@
       <w:pPr>
         <w:ind w:firstLine="709"/>
         <w:jc w:val="both"/>
+        <w:spacing w:after="240"/>
       </w:pPr>
       <w:r>
         <w:rPr>
@@ -46,7 +47,7 @@
     <w:p>
       <w:pPr>
         <w:ind w:firstLine="709"/>
-        <w:spacing w:after="0"/>
+        <w:spacing w:after="0" w:before="0"/>
       </w:pPr>
       <w:r>
         <w:rPr>
@@ -54,13 +55,13 @@
           <w:b w:val="0"/>
           <w:sz w:val="24"/>
         </w:rPr>
-        <w:t>{TARIX_METN}</w:t>
+        <w:t xml:space="preserve">Hüququn yaranma tarixi: {TARIX_METN}</w:t>
       </w:r>
     </w:p>
     <w:p>
       <w:pPr>
         <w:ind w:firstLine="709"/>
-        <w:spacing w:before="0"/>
+        <w:spacing w:before="0" w:after="0"/>
       </w:pPr>
       <w:r>
         <w:rPr>
@@ -74,6 +75,7 @@
     <w:p>
       <w:pPr>
         <w:ind w:firstLine="709"/>
+        <w:spacing w:before="240" w:after="0"/>
       </w:pPr>
       <w:r>
         <w:rPr>

</xml_diff>

<commit_message>
fix: YER_METN 1 sətir boşluq əlavə, Qəbul etdim 8 sətir əlavə
</commit_message>
<xml_diff>
--- a/arayish_sablon.docx
+++ b/arayish_sablon.docx
@@ -75,7 +75,7 @@
     <w:p>
       <w:pPr>
         <w:ind w:firstLine="709"/>
-        <w:spacing w:before="240" w:after="0"/>
+        <w:spacing w:before="480" w:after="0"/>
       </w:pPr>
       <w:r>
         <w:rPr>
@@ -112,6 +112,14 @@
         <w:t>Şamil Əliyev</w:t>
       </w:r>
     </w:p>
+    <w:p/>
+    <w:p/>
+    <w:p/>
+    <w:p/>
+    <w:p/>
+    <w:p/>
+    <w:p/>
+    <w:p/>
     <w:p/>
     <w:p/>
     <w:p/>

</xml_diff>

<commit_message>
fix: YER_METN 20px yuxarı, Direktor 1 sətir aşağı
</commit_message>
<xml_diff>
--- a/arayish_sablon.docx
+++ b/arayish_sablon.docx
@@ -75,7 +75,7 @@
     <w:p>
       <w:pPr>
         <w:ind w:firstLine="709"/>
-        <w:spacing w:before="480" w:after="0"/>
+        <w:spacing w:before="180" w:after="0"/>
       </w:pPr>
       <w:r>
         <w:rPr>
@@ -92,7 +92,7 @@
           <w:tab w:val="right" w:pos="9637"/>
         </w:tabs>
         <w:ind w:left="709"/>
-        <w:spacing w:before="480"/>
+        <w:spacing w:before="720"/>
       </w:pPr>
       <w:r>
         <w:rPr>

</xml_diff>

<commit_message>
fix: Qəbul etdim page break ilə sabitləndi, Direktor 30px aşağı
</commit_message>
<xml_diff>
--- a/arayish_sablon.docx
+++ b/arayish_sablon.docx
@@ -92,7 +92,7 @@
           <w:tab w:val="right" w:pos="9637"/>
         </w:tabs>
         <w:ind w:left="709"/>
-        <w:spacing w:before="720"/>
+        <w:spacing w:before="1180"/>
       </w:pPr>
       <w:r>
         <w:rPr>
@@ -112,40 +112,10 @@
         <w:t>Şamil Əliyev</w:t>
       </w:r>
     </w:p>
-    <w:p/>
-    <w:p/>
-    <w:p/>
-    <w:p/>
-    <w:p/>
-    <w:p/>
-    <w:p/>
-    <w:p/>
-    <w:p/>
-    <w:p/>
-    <w:p/>
-    <w:p/>
-    <w:p/>
-    <w:p/>
-    <w:p/>
-    <w:p/>
-    <w:p/>
-    <w:p/>
-    <w:p/>
-    <w:p/>
-    <w:p/>
-    <w:p/>
-    <w:p/>
-    <w:p/>
-    <w:p/>
-    <w:p/>
-    <w:p/>
-    <w:p/>
-    <w:p/>
-    <w:p/>
-    <w:p/>
     <w:p>
       <w:pPr>
         <w:spacing w:before="0"/>
+        <w:pageBreakBefore w:val="1"/>
       </w:pPr>
       <w:r>
         <w:rPr>

</xml_diff>

<commit_message>
fix: Direktor müavini→{VEZIFE}, Şamil Əliyev→{IMZA} placeholder
</commit_message>
<xml_diff>
--- a/arayish_sablon.docx
+++ b/arayish_sablon.docx
@@ -99,7 +99,7 @@
           <w:b/>
           <w:sz w:val="24"/>
         </w:rPr>
-        <w:t>Direktor müavini</w:t>
+        <w:t>{VEZIFE}</w:t>
       </w:r>
       <w:r>
         <w:rPr>
@@ -108,7 +108,7 @@
           <w:sz w:val="24"/>
         </w:rPr>
         <w:tab/>
-        <w:t>Şamil Əliyev</w:t>
+        <w:t>{IMZA}</w:t>
       </w:r>
     </w:p>
     <w:p>

</xml_diff>